<commit_message>
fund-consultant v1.14: e-Series Shortlist Mode + Tan Aik Seng shortlist
- Add Step 4e: e-Series Shortlist Mode for new investors with upfront capital < RM1,000
- Pe-prefix fund universe, CFS ranking, Candidate 1/2/3 labelling, no allocation assigned
- Proposal output: FundShortlist HTML with Candidate Comparison Table, per-fund pie charts
- Add FundShortlist_Moderate_TanAikSeng_Apr2026.html (prior session)

Co-Authored-By: Claude Sonnet 4.6 <noreply@anthropic.com>
</commit_message>
<xml_diff>
--- a/DeploymentPlan_NguiSuiFen_Apr2026_CN.docx
+++ b/DeploymentPlan_NguiSuiFen_Apr2026_CN.docx
@@ -60,34 +60,54 @@
         <w:rPr>
           <w:sz w:val="21"/>
         </w:rPr>
-        <w:t>客户在 PeCDF-A 持有 RM 30,000。由于 PIATAF 与 PISTF 目前均处于历史最高点，为避免全额一次性投入，本计划将资金分六个月（2026年4月至9月）按比例逐步转换至目标基金。</w:t>
+        <w:t>客户在 PeCDF-A 持有 RM 30,000。由于 PIATAF 与 PISTF 目前均处于历史高点，为避免全额一次性投入，本计划分两阶段执行：</w:t>
       </w:r>
     </w:p>
     <w:p>
       <w:pPr>
-        <w:spacing w:after="40"/>
-      </w:pPr>
-    </w:p>
-    <w:p>
-      <w:pPr>
-        <w:spacing w:before="40" w:after="40"/>
+        <w:pStyle w:val="ListBullet"/>
+        <w:spacing w:before="20" w:after="40"/>
       </w:pPr>
       <w:r>
         <w:rPr>
-          <w:sz w:val="21"/>
+          <w:sz w:val="20"/>
         </w:rPr>
-        <w:t>RM 3,600（12%）将长期保留于 PeCDF-A，作为逢跌加仓的战术储备。其余 RM 26,400（88%）每月转换 RM 4,400，按目标配置比例分配至四只基金。</w:t>
+        <w:t>第一个月（4月）：以最低认购额建立各基金仓位，总投入 RM 3,500。</w:t>
       </w:r>
     </w:p>
     <w:p>
       <w:pPr>
-        <w:spacing w:before="200" w:after="80"/>
+        <w:pStyle w:val="ListBullet"/>
+        <w:spacing w:before="20" w:after="40"/>
+      </w:pPr>
+      <w:r>
+        <w:rPr>
+          <w:sz w:val="20"/>
+        </w:rPr>
+        <w:t>第2至第6个月（5月–9月）：每月转换 RM 4,580，按比例持续增持至目标金额。</w:t>
+      </w:r>
+    </w:p>
+    <w:p>
+      <w:pPr>
+        <w:pStyle w:val="ListBullet"/>
+        <w:spacing w:before="20" w:after="40"/>
+      </w:pPr>
+      <w:r>
+        <w:rPr>
+          <w:sz w:val="20"/>
+        </w:rPr>
+        <w:t>RM 3,600（12%）长期保留于 PeCDF-A，作为逢跌加仓的战术储备，不纳入部署计划。</w:t>
+      </w:r>
+    </w:p>
+    <w:p>
+      <w:pPr>
+        <w:spacing w:before="240" w:after="80"/>
       </w:pPr>
       <w:r>
         <w:rPr>
           <w:b/>
           <w:color w:val="1A365D"/>
-          <w:sz w:val="22"/>
+          <w:sz w:val="24"/>
         </w:rPr>
         <w:t>目标配置（第6个月末最终状态）</w:t>
       </w:r>
@@ -99,16 +119,17 @@
         <w:tblLook w:firstColumn="1" w:firstRow="1" w:lastColumn="0" w:lastRow="0" w:noHBand="0" w:noVBand="1" w:val="04A0"/>
       </w:tblPr>
       <w:tblGrid>
-        <w:gridCol w:w="1949"/>
-        <w:gridCol w:w="1949"/>
-        <w:gridCol w:w="1949"/>
-        <w:gridCol w:w="1949"/>
-        <w:gridCol w:w="1949"/>
+        <w:gridCol w:w="1624"/>
+        <w:gridCol w:w="1624"/>
+        <w:gridCol w:w="1624"/>
+        <w:gridCol w:w="1624"/>
+        <w:gridCol w:w="1624"/>
+        <w:gridCol w:w="1624"/>
       </w:tblGrid>
       <w:tr>
         <w:tc>
           <w:tcPr>
-            <w:tcW w:type="dxa" w:w="1587"/>
+            <w:tcW w:type="dxa" w:w="1361"/>
             <w:vAlign w:val="center"/>
             <w:shd w:val="clear" w:color="auto" w:fill="1a365d"/>
           </w:tcPr>
@@ -125,7 +146,7 @@
         </w:tc>
         <w:tc>
           <w:tcPr>
-            <w:tcW w:type="dxa" w:w="1020"/>
+            <w:tcW w:type="dxa" w:w="964"/>
             <w:vAlign w:val="center"/>
             <w:shd w:val="clear" w:color="auto" w:fill="1a365d"/>
           </w:tcPr>
@@ -142,7 +163,7 @@
         </w:tc>
         <w:tc>
           <w:tcPr>
-            <w:tcW w:type="dxa" w:w="1587"/>
+            <w:tcW w:type="dxa" w:w="1417"/>
             <w:vAlign w:val="center"/>
             <w:shd w:val="clear" w:color="auto" w:fill="1a365d"/>
           </w:tcPr>
@@ -159,7 +180,7 @@
         </w:tc>
         <w:tc>
           <w:tcPr>
-            <w:tcW w:type="dxa" w:w="1701"/>
+            <w:tcW w:type="dxa" w:w="1587"/>
             <w:vAlign w:val="center"/>
             <w:shd w:val="clear" w:color="auto" w:fill="1a365d"/>
           </w:tcPr>
@@ -170,13 +191,30 @@
                 <w:color w:val="FFFFFF"/>
                 <w:sz w:val="19"/>
               </w:rPr>
-              <w:t>每月转换（RM）</w:t>
+              <w:t>第1个月（RM）</w:t>
             </w:r>
           </w:p>
         </w:tc>
         <w:tc>
           <w:tcPr>
-            <w:tcW w:type="dxa" w:w="2835"/>
+            <w:tcW w:type="dxa" w:w="1587"/>
+            <w:vAlign w:val="center"/>
+            <w:shd w:val="clear" w:color="auto" w:fill="1a365d"/>
+          </w:tcPr>
+          <w:p>
+            <w:r>
+              <w:rPr>
+                <w:b/>
+                <w:color w:val="FFFFFF"/>
+                <w:sz w:val="19"/>
+              </w:rPr>
+              <w:t>第2–6个月/月（RM）</w:t>
+            </w:r>
+          </w:p>
+        </w:tc>
+        <w:tc>
+          <w:tcPr>
+            <w:tcW w:type="dxa" w:w="1871"/>
             <w:vAlign w:val="center"/>
             <w:shd w:val="clear" w:color="auto" w:fill="1a365d"/>
           </w:tcPr>
@@ -195,7 +233,7 @@
       <w:tr>
         <w:tc>
           <w:tcPr>
-            <w:tcW w:type="dxa" w:w="1587"/>
+            <w:tcW w:type="dxa" w:w="1361"/>
             <w:vAlign w:val="center"/>
           </w:tcPr>
           <w:p>
@@ -209,7 +247,7 @@
         </w:tc>
         <w:tc>
           <w:tcPr>
-            <w:tcW w:type="dxa" w:w="1020"/>
+            <w:tcW w:type="dxa" w:w="964"/>
             <w:vAlign w:val="center"/>
           </w:tcPr>
           <w:p>
@@ -223,7 +261,7 @@
         </w:tc>
         <w:tc>
           <w:tcPr>
-            <w:tcW w:type="dxa" w:w="1587"/>
+            <w:tcW w:type="dxa" w:w="1417"/>
             <w:vAlign w:val="center"/>
           </w:tcPr>
           <w:p>
@@ -237,7 +275,7 @@
         </w:tc>
         <w:tc>
           <w:tcPr>
-            <w:tcW w:type="dxa" w:w="1701"/>
+            <w:tcW w:type="dxa" w:w="1587"/>
             <w:vAlign w:val="center"/>
           </w:tcPr>
           <w:p>
@@ -245,13 +283,27 @@
               <w:rPr>
                 <w:sz w:val="19"/>
               </w:rPr>
-              <w:t>2,250</w:t>
+              <w:t>1,000（最低额）</w:t>
             </w:r>
           </w:p>
         </w:tc>
         <w:tc>
           <w:tcPr>
-            <w:tcW w:type="dxa" w:w="2835"/>
+            <w:tcW w:type="dxa" w:w="1587"/>
+            <w:vAlign w:val="center"/>
+          </w:tcPr>
+          <w:p>
+            <w:r>
+              <w:rPr>
+                <w:sz w:val="19"/>
+              </w:rPr>
+              <w:t>2,500</w:t>
+            </w:r>
+          </w:p>
+        </w:tc>
+        <w:tc>
+          <w:tcPr>
+            <w:tcW w:type="dxa" w:w="1871"/>
             <w:vAlign w:val="center"/>
           </w:tcPr>
           <w:p>
@@ -267,7 +319,7 @@
       <w:tr>
         <w:tc>
           <w:tcPr>
-            <w:tcW w:type="dxa" w:w="1587"/>
+            <w:tcW w:type="dxa" w:w="1361"/>
             <w:vAlign w:val="center"/>
             <w:shd w:val="clear" w:color="auto" w:fill="f7fafc"/>
           </w:tcPr>
@@ -282,7 +334,7 @@
         </w:tc>
         <w:tc>
           <w:tcPr>
-            <w:tcW w:type="dxa" w:w="1020"/>
+            <w:tcW w:type="dxa" w:w="964"/>
             <w:vAlign w:val="center"/>
             <w:shd w:val="clear" w:color="auto" w:fill="f7fafc"/>
           </w:tcPr>
@@ -297,7 +349,7 @@
         </w:tc>
         <w:tc>
           <w:tcPr>
-            <w:tcW w:type="dxa" w:w="1587"/>
+            <w:tcW w:type="dxa" w:w="1417"/>
             <w:vAlign w:val="center"/>
             <w:shd w:val="clear" w:color="auto" w:fill="f7fafc"/>
           </w:tcPr>
@@ -312,7 +364,22 @@
         </w:tc>
         <w:tc>
           <w:tcPr>
-            <w:tcW w:type="dxa" w:w="1701"/>
+            <w:tcW w:type="dxa" w:w="1587"/>
+            <w:vAlign w:val="center"/>
+            <w:shd w:val="clear" w:color="auto" w:fill="f7fafc"/>
+          </w:tcPr>
+          <w:p>
+            <w:r>
+              <w:rPr>
+                <w:sz w:val="19"/>
+              </w:rPr>
+              <w:t>1,000（最低额）</w:t>
+            </w:r>
+          </w:p>
+        </w:tc>
+        <w:tc>
+          <w:tcPr>
+            <w:tcW w:type="dxa" w:w="1587"/>
             <w:vAlign w:val="center"/>
             <w:shd w:val="clear" w:color="auto" w:fill="f7fafc"/>
           </w:tcPr>
@@ -327,7 +394,7 @@
         </w:tc>
         <w:tc>
           <w:tcPr>
-            <w:tcW w:type="dxa" w:w="2835"/>
+            <w:tcW w:type="dxa" w:w="1871"/>
             <w:vAlign w:val="center"/>
             <w:shd w:val="clear" w:color="auto" w:fill="f7fafc"/>
           </w:tcPr>
@@ -344,7 +411,7 @@
       <w:tr>
         <w:tc>
           <w:tcPr>
-            <w:tcW w:type="dxa" w:w="1587"/>
+            <w:tcW w:type="dxa" w:w="1361"/>
             <w:vAlign w:val="center"/>
           </w:tcPr>
           <w:p>
@@ -358,7 +425,7 @@
         </w:tc>
         <w:tc>
           <w:tcPr>
-            <w:tcW w:type="dxa" w:w="1020"/>
+            <w:tcW w:type="dxa" w:w="964"/>
             <w:vAlign w:val="center"/>
           </w:tcPr>
           <w:p>
@@ -372,7 +439,7 @@
         </w:tc>
         <w:tc>
           <w:tcPr>
-            <w:tcW w:type="dxa" w:w="1587"/>
+            <w:tcW w:type="dxa" w:w="1417"/>
             <w:vAlign w:val="center"/>
           </w:tcPr>
           <w:p>
@@ -386,7 +453,7 @@
         </w:tc>
         <w:tc>
           <w:tcPr>
-            <w:tcW w:type="dxa" w:w="1701"/>
+            <w:tcW w:type="dxa" w:w="1587"/>
             <w:vAlign w:val="center"/>
           </w:tcPr>
           <w:p>
@@ -394,13 +461,27 @@
               <w:rPr>
                 <w:sz w:val="19"/>
               </w:rPr>
-              <w:t>650</w:t>
+              <w:t>1,000（最低额）</w:t>
             </w:r>
           </w:p>
         </w:tc>
         <w:tc>
           <w:tcPr>
-            <w:tcW w:type="dxa" w:w="2835"/>
+            <w:tcW w:type="dxa" w:w="1587"/>
+            <w:vAlign w:val="center"/>
+          </w:tcPr>
+          <w:p>
+            <w:r>
+              <w:rPr>
+                <w:sz w:val="19"/>
+              </w:rPr>
+              <w:t>580</w:t>
+            </w:r>
+          </w:p>
+        </w:tc>
+        <w:tc>
+          <w:tcPr>
+            <w:tcW w:type="dxa" w:w="1871"/>
             <w:vAlign w:val="center"/>
           </w:tcPr>
           <w:p>
@@ -416,7 +497,7 @@
       <w:tr>
         <w:tc>
           <w:tcPr>
-            <w:tcW w:type="dxa" w:w="1587"/>
+            <w:tcW w:type="dxa" w:w="1361"/>
             <w:vAlign w:val="center"/>
             <w:shd w:val="clear" w:color="auto" w:fill="f7fafc"/>
           </w:tcPr>
@@ -431,7 +512,7 @@
         </w:tc>
         <w:tc>
           <w:tcPr>
-            <w:tcW w:type="dxa" w:w="1020"/>
+            <w:tcW w:type="dxa" w:w="964"/>
             <w:vAlign w:val="center"/>
             <w:shd w:val="clear" w:color="auto" w:fill="f7fafc"/>
           </w:tcPr>
@@ -446,7 +527,7 @@
         </w:tc>
         <w:tc>
           <w:tcPr>
-            <w:tcW w:type="dxa" w:w="1587"/>
+            <w:tcW w:type="dxa" w:w="1417"/>
             <w:vAlign w:val="center"/>
             <w:shd w:val="clear" w:color="auto" w:fill="f7fafc"/>
           </w:tcPr>
@@ -461,7 +542,22 @@
         </w:tc>
         <w:tc>
           <w:tcPr>
-            <w:tcW w:type="dxa" w:w="1701"/>
+            <w:tcW w:type="dxa" w:w="1587"/>
+            <w:vAlign w:val="center"/>
+            <w:shd w:val="clear" w:color="auto" w:fill="f7fafc"/>
+          </w:tcPr>
+          <w:p>
+            <w:r>
+              <w:rPr>
+                <w:sz w:val="19"/>
+              </w:rPr>
+              <w:t>500（预先配置）</w:t>
+            </w:r>
+          </w:p>
+        </w:tc>
+        <w:tc>
+          <w:tcPr>
+            <w:tcW w:type="dxa" w:w="1587"/>
             <w:vAlign w:val="center"/>
             <w:shd w:val="clear" w:color="auto" w:fill="f7fafc"/>
           </w:tcPr>
@@ -476,7 +572,7 @@
         </w:tc>
         <w:tc>
           <w:tcPr>
-            <w:tcW w:type="dxa" w:w="2835"/>
+            <w:tcW w:type="dxa" w:w="1871"/>
             <w:vAlign w:val="center"/>
             <w:shd w:val="clear" w:color="auto" w:fill="f7fafc"/>
           </w:tcPr>
@@ -493,7 +589,7 @@
       <w:tr>
         <w:tc>
           <w:tcPr>
-            <w:tcW w:type="dxa" w:w="1587"/>
+            <w:tcW w:type="dxa" w:w="1361"/>
             <w:vAlign w:val="center"/>
           </w:tcPr>
           <w:p>
@@ -507,7 +603,7 @@
         </w:tc>
         <w:tc>
           <w:tcPr>
-            <w:tcW w:type="dxa" w:w="1020"/>
+            <w:tcW w:type="dxa" w:w="964"/>
             <w:vAlign w:val="center"/>
           </w:tcPr>
           <w:p>
@@ -521,7 +617,7 @@
         </w:tc>
         <w:tc>
           <w:tcPr>
-            <w:tcW w:type="dxa" w:w="1587"/>
+            <w:tcW w:type="dxa" w:w="1417"/>
             <w:vAlign w:val="center"/>
           </w:tcPr>
           <w:p>
@@ -535,7 +631,7 @@
         </w:tc>
         <w:tc>
           <w:tcPr>
-            <w:tcW w:type="dxa" w:w="1701"/>
+            <w:tcW w:type="dxa" w:w="1587"/>
             <w:vAlign w:val="center"/>
           </w:tcPr>
           <w:p>
@@ -549,7 +645,7 @@
         </w:tc>
         <w:tc>
           <w:tcPr>
-            <w:tcW w:type="dxa" w:w="2835"/>
+            <w:tcW w:type="dxa" w:w="1587"/>
             <w:vAlign w:val="center"/>
           </w:tcPr>
           <w:p>
@@ -557,7 +653,21 @@
               <w:rPr>
                 <w:sz w:val="19"/>
               </w:rPr>
-              <w:t>战术储备（逢跌加仓）</w:t>
+              <w:t>— （保留）</w:t>
+            </w:r>
+          </w:p>
+        </w:tc>
+        <w:tc>
+          <w:tcPr>
+            <w:tcW w:type="dxa" w:w="1871"/>
+            <w:vAlign w:val="center"/>
+          </w:tcPr>
+          <w:p>
+            <w:r>
+              <w:rPr>
+                <w:sz w:val="19"/>
+              </w:rPr>
+              <w:t>战术储备</w:t>
             </w:r>
           </w:p>
         </w:tc>
@@ -565,7 +675,7 @@
       <w:tr>
         <w:tc>
           <w:tcPr>
-            <w:tcW w:type="dxa" w:w="1587"/>
+            <w:tcW w:type="dxa" w:w="1361"/>
             <w:vAlign w:val="center"/>
             <w:shd w:val="clear" w:color="auto" w:fill="ebf8ff"/>
           </w:tcPr>
@@ -581,7 +691,7 @@
         </w:tc>
         <w:tc>
           <w:tcPr>
-            <w:tcW w:type="dxa" w:w="1020"/>
+            <w:tcW w:type="dxa" w:w="964"/>
             <w:vAlign w:val="center"/>
             <w:shd w:val="clear" w:color="auto" w:fill="ebf8ff"/>
           </w:tcPr>
@@ -597,7 +707,7 @@
         </w:tc>
         <w:tc>
           <w:tcPr>
-            <w:tcW w:type="dxa" w:w="1587"/>
+            <w:tcW w:type="dxa" w:w="1417"/>
             <w:vAlign w:val="center"/>
             <w:shd w:val="clear" w:color="auto" w:fill="ebf8ff"/>
           </w:tcPr>
@@ -613,7 +723,7 @@
         </w:tc>
         <w:tc>
           <w:tcPr>
-            <w:tcW w:type="dxa" w:w="1701"/>
+            <w:tcW w:type="dxa" w:w="1587"/>
             <w:vAlign w:val="center"/>
             <w:shd w:val="clear" w:color="auto" w:fill="ebf8ff"/>
           </w:tcPr>
@@ -623,13 +733,29 @@
                 <w:b/>
                 <w:sz w:val="19"/>
               </w:rPr>
-              <w:t>4,400 × 6</w:t>
+              <w:t>3,500</w:t>
             </w:r>
           </w:p>
         </w:tc>
         <w:tc>
           <w:tcPr>
-            <w:tcW w:type="dxa" w:w="2835"/>
+            <w:tcW w:type="dxa" w:w="1587"/>
+            <w:vAlign w:val="center"/>
+            <w:shd w:val="clear" w:color="auto" w:fill="ebf8ff"/>
+          </w:tcPr>
+          <w:p>
+            <w:r>
+              <w:rPr>
+                <w:b/>
+                <w:sz w:val="19"/>
+              </w:rPr>
+              <w:t>4,580 × 5</w:t>
+            </w:r>
+          </w:p>
+        </w:tc>
+        <w:tc>
+          <w:tcPr>
+            <w:tcW w:type="dxa" w:w="1871"/>
             <w:vAlign w:val="center"/>
             <w:shd w:val="clear" w:color="auto" w:fill="ebf8ff"/>
           </w:tcPr>
@@ -646,13 +772,13 @@
     </w:tbl>
     <w:p>
       <w:pPr>
-        <w:spacing w:before="280" w:after="80"/>
+        <w:spacing w:before="240" w:after="80"/>
       </w:pPr>
       <w:r>
         <w:rPr>
           <w:b/>
           <w:color w:val="1A365D"/>
-          <w:sz w:val="22"/>
+          <w:sz w:val="24"/>
         </w:rPr>
         <w:t>逐月操作计划</w:t>
       </w:r>
@@ -664,14 +790,15 @@
         <w:tblLook w:firstColumn="1" w:firstRow="1" w:lastColumn="0" w:lastRow="0" w:noHBand="0" w:noVBand="1" w:val="04A0"/>
       </w:tblPr>
       <w:tblGrid>
-        <w:gridCol w:w="3249"/>
-        <w:gridCol w:w="3249"/>
-        <w:gridCol w:w="3249"/>
+        <w:gridCol w:w="2436"/>
+        <w:gridCol w:w="2436"/>
+        <w:gridCol w:w="2436"/>
+        <w:gridCol w:w="2436"/>
       </w:tblGrid>
       <w:tr>
         <w:tc>
           <w:tcPr>
-            <w:tcW w:type="dxa" w:w="1587"/>
+            <w:tcW w:type="dxa" w:w="1020"/>
             <w:vAlign w:val="top"/>
             <w:shd w:val="clear" w:color="auto" w:fill="1a365d"/>
           </w:tcPr>
@@ -688,7 +815,7 @@
         </w:tc>
         <w:tc>
           <w:tcPr>
-            <w:tcW w:type="dxa" w:w="5329"/>
+            <w:tcW w:type="dxa" w:w="4876"/>
             <w:vAlign w:val="top"/>
             <w:shd w:val="clear" w:color="auto" w:fill="1a365d"/>
           </w:tcPr>
@@ -705,7 +832,24 @@
         </w:tc>
         <w:tc>
           <w:tcPr>
-            <w:tcW w:type="dxa" w:w="1814"/>
+            <w:tcW w:type="dxa" w:w="1361"/>
+            <w:vAlign w:val="top"/>
+            <w:shd w:val="clear" w:color="auto" w:fill="1a365d"/>
+          </w:tcPr>
+          <w:p>
+            <w:r>
+              <w:rPr>
+                <w:b/>
+                <w:color w:val="FFFFFF"/>
+                <w:sz w:val="19"/>
+              </w:rPr>
+              <w:t>本月转出（RM）</w:t>
+            </w:r>
+          </w:p>
+        </w:tc>
+        <w:tc>
+          <w:tcPr>
+            <w:tcW w:type="dxa" w:w="1474"/>
             <w:vAlign w:val="top"/>
             <w:shd w:val="clear" w:color="auto" w:fill="1a365d"/>
           </w:tcPr>
@@ -724,7 +868,7 @@
       <w:tr>
         <w:tc>
           <w:tcPr>
-            <w:tcW w:type="dxa" w:w="1587"/>
+            <w:tcW w:type="dxa" w:w="1020"/>
             <w:vAlign w:val="top"/>
           </w:tcPr>
           <w:p>
@@ -732,13 +876,15 @@
               <w:rPr>
                 <w:sz w:val="19"/>
               </w:rPr>
-              <w:t>2026年4月</w:t>
+              <w:t>2026年</w:t>
+              <w:br/>
+              <w:t>4月</w:t>
             </w:r>
           </w:p>
         </w:tc>
         <w:tc>
           <w:tcPr>
-            <w:tcW w:type="dxa" w:w="5329"/>
+            <w:tcW w:type="dxa" w:w="4876"/>
             <w:vAlign w:val="top"/>
           </w:tcPr>
           <w:p>
@@ -746,13 +892,21 @@
               <w:rPr>
                 <w:sz w:val="19"/>
               </w:rPr>
-              <w:t>从 PeCDF-A 转换 RM 4,400 至目标基金（见下方明细）。第一批次，按计划全额转换。</w:t>
+              <w:t>开仓月：</w:t>
+              <w:br/>
+              <w:t>· PIATAF RM 1,000（最低认购额）</w:t>
+              <w:br/>
+              <w:t>· PISTF RM 1,000（最低认购额）</w:t>
+              <w:br/>
+              <w:t>· PBGTHF RM 1,000（最低认购额）</w:t>
+              <w:br/>
+              <w:t>· PeEMAS RM 500（黄金预先配置）</w:t>
             </w:r>
           </w:p>
         </w:tc>
         <w:tc>
           <w:tcPr>
-            <w:tcW w:type="dxa" w:w="1814"/>
+            <w:tcW w:type="dxa" w:w="1361"/>
             <w:vAlign w:val="top"/>
           </w:tcPr>
           <w:p>
@@ -760,7 +914,21 @@
               <w:rPr>
                 <w:sz w:val="19"/>
               </w:rPr>
-              <w:t>RM 25,600</w:t>
+              <w:t>3,500</w:t>
+            </w:r>
+          </w:p>
+        </w:tc>
+        <w:tc>
+          <w:tcPr>
+            <w:tcW w:type="dxa" w:w="1474"/>
+            <w:vAlign w:val="top"/>
+          </w:tcPr>
+          <w:p>
+            <w:r>
+              <w:rPr>
+                <w:sz w:val="19"/>
+              </w:rPr>
+              <w:t>26,500</w:t>
             </w:r>
           </w:p>
         </w:tc>
@@ -768,7 +936,7 @@
       <w:tr>
         <w:tc>
           <w:tcPr>
-            <w:tcW w:type="dxa" w:w="1587"/>
+            <w:tcW w:type="dxa" w:w="1020"/>
             <w:vAlign w:val="top"/>
             <w:shd w:val="clear" w:color="auto" w:fill="f7fafc"/>
           </w:tcPr>
@@ -777,13 +945,15 @@
               <w:rPr>
                 <w:sz w:val="19"/>
               </w:rPr>
-              <w:t>2026年5月</w:t>
+              <w:t>2026年</w:t>
+              <w:br/>
+              <w:t>5月</w:t>
             </w:r>
           </w:p>
         </w:tc>
         <w:tc>
           <w:tcPr>
-            <w:tcW w:type="dxa" w:w="5329"/>
+            <w:tcW w:type="dxa" w:w="4876"/>
             <w:vAlign w:val="top"/>
             <w:shd w:val="clear" w:color="auto" w:fill="f7fafc"/>
           </w:tcPr>
@@ -792,13 +962,15 @@
               <w:rPr>
                 <w:sz w:val="19"/>
               </w:rPr>
-              <w:t>从 PeCDF-A 转换 RM 4,400。转换前检查 PIATAF 与 PISTF 净值回撤——若任一基金较4月净值跌幅 ≥5%，优先加仓该基金，其余资金可延后两周转换。</w:t>
+              <w:t>按比例增持：PIATAF RM 2,500 · PISTF RM 1,000 · PBGTHF RM 580 · PeEMAS RM 500</w:t>
+              <w:br/>
+              <w:t>转换前检查回撤——若任一基金较上月净值跌幅 ≥5%，优先加仓该基金。</w:t>
             </w:r>
           </w:p>
         </w:tc>
         <w:tc>
           <w:tcPr>
-            <w:tcW w:type="dxa" w:w="1814"/>
+            <w:tcW w:type="dxa" w:w="1361"/>
             <w:vAlign w:val="top"/>
             <w:shd w:val="clear" w:color="auto" w:fill="f7fafc"/>
           </w:tcPr>
@@ -807,59 +979,13 @@
               <w:rPr>
                 <w:sz w:val="19"/>
               </w:rPr>
-              <w:t>RM 21,200</w:t>
-            </w:r>
-          </w:p>
-        </w:tc>
-      </w:tr>
-      <w:tr>
-        <w:tc>
-          <w:tcPr>
-            <w:tcW w:type="dxa" w:w="1587"/>
-            <w:vAlign w:val="top"/>
-          </w:tcPr>
-          <w:p>
-            <w:r>
-              <w:rPr>
-                <w:sz w:val="19"/>
-              </w:rPr>
-              <w:t>2026年6月</w:t>
+              <w:t>4,580</w:t>
             </w:r>
           </w:p>
         </w:tc>
         <w:tc>
           <w:tcPr>
-            <w:tcW w:type="dxa" w:w="5329"/>
-            <w:vAlign w:val="top"/>
-          </w:tcPr>
-          <w:p>
-            <w:r>
-              <w:rPr>
-                <w:sz w:val="19"/>
-              </w:rPr>
-              <w:t>从 PeCDF-A 转换 RM 4,400。中期检视：确认组合进度，检查是否触发历史高点回撤提示。</w:t>
-            </w:r>
-          </w:p>
-        </w:tc>
-        <w:tc>
-          <w:tcPr>
-            <w:tcW w:type="dxa" w:w="1814"/>
-            <w:vAlign w:val="top"/>
-          </w:tcPr>
-          <w:p>
-            <w:r>
-              <w:rPr>
-                <w:sz w:val="19"/>
-              </w:rPr>
-              <w:t>RM 16,800</w:t>
-            </w:r>
-          </w:p>
-        </w:tc>
-      </w:tr>
-      <w:tr>
-        <w:tc>
-          <w:tcPr>
-            <w:tcW w:type="dxa" w:w="1587"/>
+            <w:tcW w:type="dxa" w:w="1474"/>
             <w:vAlign w:val="top"/>
             <w:shd w:val="clear" w:color="auto" w:fill="f7fafc"/>
           </w:tcPr>
@@ -868,13 +994,77 @@
               <w:rPr>
                 <w:sz w:val="19"/>
               </w:rPr>
-              <w:t>2026年7月</w:t>
+              <w:t>21,920</w:t>
+            </w:r>
+          </w:p>
+        </w:tc>
+      </w:tr>
+      <w:tr>
+        <w:tc>
+          <w:tcPr>
+            <w:tcW w:type="dxa" w:w="1020"/>
+            <w:vAlign w:val="top"/>
+          </w:tcPr>
+          <w:p>
+            <w:r>
+              <w:rPr>
+                <w:sz w:val="19"/>
+              </w:rPr>
+              <w:t>2026年</w:t>
+              <w:br/>
+              <w:t>6月</w:t>
             </w:r>
           </w:p>
         </w:tc>
         <w:tc>
           <w:tcPr>
-            <w:tcW w:type="dxa" w:w="5329"/>
+            <w:tcW w:type="dxa" w:w="4876"/>
+            <w:vAlign w:val="top"/>
+          </w:tcPr>
+          <w:p>
+            <w:r>
+              <w:rPr>
+                <w:sz w:val="19"/>
+              </w:rPr>
+              <w:t>按比例增持：PIATAF RM 2,500 · PISTF RM 1,000 · PBGTHF RM 580 · PeEMAS RM 500</w:t>
+              <w:br/>
+              <w:t>中期检视：确认组合进度，检查历史高点回撤提示。</w:t>
+            </w:r>
+          </w:p>
+        </w:tc>
+        <w:tc>
+          <w:tcPr>
+            <w:tcW w:type="dxa" w:w="1361"/>
+            <w:vAlign w:val="top"/>
+          </w:tcPr>
+          <w:p>
+            <w:r>
+              <w:rPr>
+                <w:sz w:val="19"/>
+              </w:rPr>
+              <w:t>4,580</w:t>
+            </w:r>
+          </w:p>
+        </w:tc>
+        <w:tc>
+          <w:tcPr>
+            <w:tcW w:type="dxa" w:w="1474"/>
+            <w:vAlign w:val="top"/>
+          </w:tcPr>
+          <w:p>
+            <w:r>
+              <w:rPr>
+                <w:sz w:val="19"/>
+              </w:rPr>
+              <w:t>17,340</w:t>
+            </w:r>
+          </w:p>
+        </w:tc>
+      </w:tr>
+      <w:tr>
+        <w:tc>
+          <w:tcPr>
+            <w:tcW w:type="dxa" w:w="1020"/>
             <w:vAlign w:val="top"/>
             <w:shd w:val="clear" w:color="auto" w:fill="f7fafc"/>
           </w:tcPr>
@@ -883,13 +1073,15 @@
               <w:rPr>
                 <w:sz w:val="19"/>
               </w:rPr>
-              <w:t>从 PeCDF-A 转换 RM 4,400。如无跌幅触发条件，按原计划执行。若任一基金自历史高点回撤 ≥10%，提前加速部署（见下方）。</w:t>
+              <w:t>2026年</w:t>
+              <w:br/>
+              <w:t>7月</w:t>
             </w:r>
           </w:p>
         </w:tc>
         <w:tc>
           <w:tcPr>
-            <w:tcW w:type="dxa" w:w="1814"/>
+            <w:tcW w:type="dxa" w:w="4876"/>
             <w:vAlign w:val="top"/>
             <w:shd w:val="clear" w:color="auto" w:fill="f7fafc"/>
           </w:tcPr>
@@ -898,59 +1090,15 @@
               <w:rPr>
                 <w:sz w:val="19"/>
               </w:rPr>
-              <w:t>RM 12,400</w:t>
-            </w:r>
-          </w:p>
-        </w:tc>
-      </w:tr>
-      <w:tr>
-        <w:tc>
-          <w:tcPr>
-            <w:tcW w:type="dxa" w:w="1587"/>
-            <w:vAlign w:val="top"/>
-          </w:tcPr>
-          <w:p>
-            <w:r>
-              <w:rPr>
-                <w:sz w:val="19"/>
-              </w:rPr>
-              <w:t>2026年8月</w:t>
+              <w:t>按比例增持：PIATAF RM 2,500 · PISTF RM 1,000 · PBGTHF RM 580 · PeEMAS RM 500</w:t>
+              <w:br/>
+              <w:t>如触发跌幅条件（≥10% 回撤），可提前加速部署（见下方规则）。</w:t>
             </w:r>
           </w:p>
         </w:tc>
         <w:tc>
           <w:tcPr>
-            <w:tcW w:type="dxa" w:w="5329"/>
-            <w:vAlign w:val="top"/>
-          </w:tcPr>
-          <w:p>
-            <w:r>
-              <w:rPr>
-                <w:sz w:val="19"/>
-              </w:rPr>
-              <w:t>从 PeCDF-A 转换 RM 4,400。</w:t>
-            </w:r>
-          </w:p>
-        </w:tc>
-        <w:tc>
-          <w:tcPr>
-            <w:tcW w:type="dxa" w:w="1814"/>
-            <w:vAlign w:val="top"/>
-          </w:tcPr>
-          <w:p>
-            <w:r>
-              <w:rPr>
-                <w:sz w:val="19"/>
-              </w:rPr>
-              <w:t>RM 8,000</w:t>
-            </w:r>
-          </w:p>
-        </w:tc>
-      </w:tr>
-      <w:tr>
-        <w:tc>
-          <w:tcPr>
-            <w:tcW w:type="dxa" w:w="1587"/>
+            <w:tcW w:type="dxa" w:w="1361"/>
             <w:vAlign w:val="top"/>
             <w:shd w:val="clear" w:color="auto" w:fill="f7fafc"/>
           </w:tcPr>
@@ -959,13 +1107,13 @@
               <w:rPr>
                 <w:sz w:val="19"/>
               </w:rPr>
-              <w:t>2026年9月</w:t>
+              <w:t>4,580</w:t>
             </w:r>
           </w:p>
         </w:tc>
         <w:tc>
           <w:tcPr>
-            <w:tcW w:type="dxa" w:w="5329"/>
+            <w:tcW w:type="dxa" w:w="1474"/>
             <w:vAlign w:val="top"/>
             <w:shd w:val="clear" w:color="auto" w:fill="f7fafc"/>
           </w:tcPr>
@@ -974,13 +1122,75 @@
               <w:rPr>
                 <w:sz w:val="19"/>
               </w:rPr>
-              <w:t>最后一批次——转换剩余 RM 4,400。全部部署完成，PeCDF-A 保留 RM 3,600 战术储备。</w:t>
+              <w:t>12,760</w:t>
+            </w:r>
+          </w:p>
+        </w:tc>
+      </w:tr>
+      <w:tr>
+        <w:tc>
+          <w:tcPr>
+            <w:tcW w:type="dxa" w:w="1020"/>
+            <w:vAlign w:val="top"/>
+          </w:tcPr>
+          <w:p>
+            <w:r>
+              <w:rPr>
+                <w:sz w:val="19"/>
+              </w:rPr>
+              <w:t>2026年</w:t>
+              <w:br/>
+              <w:t>8月</w:t>
             </w:r>
           </w:p>
         </w:tc>
         <w:tc>
           <w:tcPr>
-            <w:tcW w:type="dxa" w:w="1814"/>
+            <w:tcW w:type="dxa" w:w="4876"/>
+            <w:vAlign w:val="top"/>
+          </w:tcPr>
+          <w:p>
+            <w:r>
+              <w:rPr>
+                <w:sz w:val="19"/>
+              </w:rPr>
+              <w:t>按比例增持：PIATAF RM 2,500 · PISTF RM 1,000 · PBGTHF RM 580 · PeEMAS RM 500</w:t>
+            </w:r>
+          </w:p>
+        </w:tc>
+        <w:tc>
+          <w:tcPr>
+            <w:tcW w:type="dxa" w:w="1361"/>
+            <w:vAlign w:val="top"/>
+          </w:tcPr>
+          <w:p>
+            <w:r>
+              <w:rPr>
+                <w:sz w:val="19"/>
+              </w:rPr>
+              <w:t>4,580</w:t>
+            </w:r>
+          </w:p>
+        </w:tc>
+        <w:tc>
+          <w:tcPr>
+            <w:tcW w:type="dxa" w:w="1474"/>
+            <w:vAlign w:val="top"/>
+          </w:tcPr>
+          <w:p>
+            <w:r>
+              <w:rPr>
+                <w:sz w:val="19"/>
+              </w:rPr>
+              <w:t>8,180</w:t>
+            </w:r>
+          </w:p>
+        </w:tc>
+      </w:tr>
+      <w:tr>
+        <w:tc>
+          <w:tcPr>
+            <w:tcW w:type="dxa" w:w="1020"/>
             <w:vAlign w:val="top"/>
             <w:shd w:val="clear" w:color="auto" w:fill="f7fafc"/>
           </w:tcPr>
@@ -989,96 +1199,56 @@
               <w:rPr>
                 <w:sz w:val="19"/>
               </w:rPr>
-              <w:t>RM 3,600</w:t>
-            </w:r>
-          </w:p>
-        </w:tc>
-      </w:tr>
-    </w:tbl>
-    <w:p>
-      <w:pPr>
-        <w:spacing w:before="280" w:after="80"/>
-      </w:pPr>
-      <w:r>
-        <w:rPr>
-          <w:b/>
-          <w:color w:val="1A365D"/>
-          <w:sz w:val="22"/>
-        </w:rPr>
-        <w:t>每批次转换明细（每月固定）</w:t>
-      </w:r>
-    </w:p>
-    <w:p>
-      <w:pPr>
-        <w:spacing w:before="40" w:after="40"/>
-      </w:pPr>
-      <w:r>
-        <w:rPr>
-          <w:sz w:val="21"/>
-        </w:rPr>
-        <w:t>每月从 PeCDF-A 转换的 RM 4,400 按以下比例分配：</w:t>
-      </w:r>
-    </w:p>
-    <w:tbl>
-      <w:tblPr>
-        <w:tblStyle w:val="TableGrid"/>
-        <w:tblW w:type="auto" w:w="0"/>
-        <w:tblLook w:firstColumn="1" w:firstRow="1" w:lastColumn="0" w:lastRow="0" w:noHBand="0" w:noVBand="1" w:val="04A0"/>
-      </w:tblPr>
-      <w:tblGrid>
-        <w:gridCol w:w="3249"/>
-        <w:gridCol w:w="3249"/>
-        <w:gridCol w:w="3249"/>
-      </w:tblGrid>
-      <w:tr>
-        <w:tc>
-          <w:tcPr>
-            <w:tcW w:type="dxa" w:w="1984"/>
-            <w:vAlign w:val="center"/>
-            <w:shd w:val="clear" w:color="auto" w:fill="1a365d"/>
-          </w:tcPr>
-          <w:p>
-            <w:r>
-              <w:rPr>
-                <w:b/>
-                <w:color w:val="FFFFFF"/>
-                <w:sz w:val="19"/>
-              </w:rPr>
-              <w:t>基金</w:t>
+              <w:t>2026年</w:t>
+              <w:br/>
+              <w:t>9月</w:t>
             </w:r>
           </w:p>
         </w:tc>
         <w:tc>
           <w:tcPr>
-            <w:tcW w:type="dxa" w:w="2154"/>
-            <w:vAlign w:val="center"/>
-            <w:shd w:val="clear" w:color="auto" w:fill="1a365d"/>
+            <w:tcW w:type="dxa" w:w="4876"/>
+            <w:vAlign w:val="top"/>
+            <w:shd w:val="clear" w:color="auto" w:fill="f7fafc"/>
           </w:tcPr>
           <w:p>
             <w:r>
               <w:rPr>
-                <w:b/>
-                <w:color w:val="FFFFFF"/>
                 <w:sz w:val="19"/>
               </w:rPr>
-              <w:t>每月金额（RM）</w:t>
+              <w:t>最后批次：PIATAF RM 2,500 · PISTF RM 1,000 · PBGTHF RM 580 · PeEMAS RM 500</w:t>
+              <w:br/>
+              <w:t>全部部署完成，PeCDF-A 保留 RM 3,600 战术储备。</w:t>
             </w:r>
           </w:p>
         </w:tc>
         <w:tc>
           <w:tcPr>
-            <w:tcW w:type="dxa" w:w="2381"/>
-            <w:vAlign w:val="center"/>
-            <w:shd w:val="clear" w:color="auto" w:fill="1a365d"/>
+            <w:tcW w:type="dxa" w:w="1361"/>
+            <w:vAlign w:val="top"/>
+            <w:shd w:val="clear" w:color="auto" w:fill="f7fafc"/>
           </w:tcPr>
           <w:p>
             <w:r>
               <w:rPr>
-                <w:b/>
-                <w:color w:val="FFFFFF"/>
                 <w:sz w:val="19"/>
               </w:rPr>
-              <w:t>6个月累计（RM）</w:t>
+              <w:t>4,580</w:t>
+            </w:r>
+          </w:p>
+        </w:tc>
+        <w:tc>
+          <w:tcPr>
+            <w:tcW w:type="dxa" w:w="1474"/>
+            <w:vAlign w:val="top"/>
+            <w:shd w:val="clear" w:color="auto" w:fill="f7fafc"/>
+          </w:tcPr>
+          <w:p>
+            <w:r>
+              <w:rPr>
+                <w:sz w:val="19"/>
+              </w:rPr>
+              <w:t>3,600</w:t>
             </w:r>
           </w:p>
         </w:tc>
@@ -1086,190 +1256,8 @@
       <w:tr>
         <w:tc>
           <w:tcPr>
-            <w:tcW w:type="dxa" w:w="1984"/>
-            <w:vAlign w:val="center"/>
-          </w:tcPr>
-          <w:p>
-            <w:r>
-              <w:rPr>
-                <w:sz w:val="19"/>
-              </w:rPr>
-              <w:t>PIATAF</w:t>
-            </w:r>
-          </w:p>
-        </w:tc>
-        <w:tc>
-          <w:tcPr>
-            <w:tcW w:type="dxa" w:w="2154"/>
-            <w:vAlign w:val="center"/>
-          </w:tcPr>
-          <w:p>
-            <w:r>
-              <w:rPr>
-                <w:sz w:val="19"/>
-              </w:rPr>
-              <w:t>2,250</w:t>
-            </w:r>
-          </w:p>
-        </w:tc>
-        <w:tc>
-          <w:tcPr>
-            <w:tcW w:type="dxa" w:w="2381"/>
-            <w:vAlign w:val="center"/>
-          </w:tcPr>
-          <w:p>
-            <w:r>
-              <w:rPr>
-                <w:sz w:val="19"/>
-              </w:rPr>
-              <w:t>13,500</w:t>
-            </w:r>
-          </w:p>
-        </w:tc>
-      </w:tr>
-      <w:tr>
-        <w:tc>
-          <w:tcPr>
-            <w:tcW w:type="dxa" w:w="1984"/>
-            <w:vAlign w:val="center"/>
-            <w:shd w:val="clear" w:color="auto" w:fill="f7fafc"/>
-          </w:tcPr>
-          <w:p>
-            <w:r>
-              <w:rPr>
-                <w:sz w:val="19"/>
-              </w:rPr>
-              <w:t>PISTF</w:t>
-            </w:r>
-          </w:p>
-        </w:tc>
-        <w:tc>
-          <w:tcPr>
-            <w:tcW w:type="dxa" w:w="2154"/>
-            <w:vAlign w:val="center"/>
-            <w:shd w:val="clear" w:color="auto" w:fill="f7fafc"/>
-          </w:tcPr>
-          <w:p>
-            <w:r>
-              <w:rPr>
-                <w:sz w:val="19"/>
-              </w:rPr>
-              <w:t>1,000</w:t>
-            </w:r>
-          </w:p>
-        </w:tc>
-        <w:tc>
-          <w:tcPr>
-            <w:tcW w:type="dxa" w:w="2381"/>
-            <w:vAlign w:val="center"/>
-            <w:shd w:val="clear" w:color="auto" w:fill="f7fafc"/>
-          </w:tcPr>
-          <w:p>
-            <w:r>
-              <w:rPr>
-                <w:sz w:val="19"/>
-              </w:rPr>
-              <w:t>6,000</w:t>
-            </w:r>
-          </w:p>
-        </w:tc>
-      </w:tr>
-      <w:tr>
-        <w:tc>
-          <w:tcPr>
-            <w:tcW w:type="dxa" w:w="1984"/>
-            <w:vAlign w:val="center"/>
-          </w:tcPr>
-          <w:p>
-            <w:r>
-              <w:rPr>
-                <w:sz w:val="19"/>
-              </w:rPr>
-              <w:t>PBGTHF</w:t>
-            </w:r>
-          </w:p>
-        </w:tc>
-        <w:tc>
-          <w:tcPr>
-            <w:tcW w:type="dxa" w:w="2154"/>
-            <w:vAlign w:val="center"/>
-          </w:tcPr>
-          <w:p>
-            <w:r>
-              <w:rPr>
-                <w:sz w:val="19"/>
-              </w:rPr>
-              <w:t>650</w:t>
-            </w:r>
-          </w:p>
-        </w:tc>
-        <w:tc>
-          <w:tcPr>
-            <w:tcW w:type="dxa" w:w="2381"/>
-            <w:vAlign w:val="center"/>
-          </w:tcPr>
-          <w:p>
-            <w:r>
-              <w:rPr>
-                <w:sz w:val="19"/>
-              </w:rPr>
-              <w:t>3,900</w:t>
-            </w:r>
-          </w:p>
-        </w:tc>
-      </w:tr>
-      <w:tr>
-        <w:tc>
-          <w:tcPr>
-            <w:tcW w:type="dxa" w:w="1984"/>
-            <w:vAlign w:val="center"/>
-            <w:shd w:val="clear" w:color="auto" w:fill="f7fafc"/>
-          </w:tcPr>
-          <w:p>
-            <w:r>
-              <w:rPr>
-                <w:sz w:val="19"/>
-              </w:rPr>
-              <w:t>PeEMAS</w:t>
-            </w:r>
-          </w:p>
-        </w:tc>
-        <w:tc>
-          <w:tcPr>
-            <w:tcW w:type="dxa" w:w="2154"/>
-            <w:vAlign w:val="center"/>
-            <w:shd w:val="clear" w:color="auto" w:fill="f7fafc"/>
-          </w:tcPr>
-          <w:p>
-            <w:r>
-              <w:rPr>
-                <w:sz w:val="19"/>
-              </w:rPr>
-              <w:t>500</w:t>
-            </w:r>
-          </w:p>
-        </w:tc>
-        <w:tc>
-          <w:tcPr>
-            <w:tcW w:type="dxa" w:w="2381"/>
-            <w:vAlign w:val="center"/>
-            <w:shd w:val="clear" w:color="auto" w:fill="f7fafc"/>
-          </w:tcPr>
-          <w:p>
-            <w:r>
-              <w:rPr>
-                <w:sz w:val="19"/>
-              </w:rPr>
-              <w:t>3,000</w:t>
-            </w:r>
-          </w:p>
-        </w:tc>
-      </w:tr>
-      <w:tr>
-        <w:tc>
-          <w:tcPr>
-            <w:tcW w:type="dxa" w:w="1984"/>
-            <w:vAlign w:val="center"/>
+            <w:tcW w:type="dxa" w:w="1020"/>
+            <w:vAlign w:val="top"/>
             <w:shd w:val="clear" w:color="auto" w:fill="ebf8ff"/>
           </w:tcPr>
           <w:p>
@@ -1284,8 +1272,8 @@
         </w:tc>
         <w:tc>
           <w:tcPr>
-            <w:tcW w:type="dxa" w:w="2154"/>
-            <w:vAlign w:val="center"/>
+            <w:tcW w:type="dxa" w:w="4876"/>
+            <w:vAlign w:val="top"/>
             <w:shd w:val="clear" w:color="auto" w:fill="ebf8ff"/>
           </w:tcPr>
           <w:p>
@@ -1294,14 +1282,13 @@
                 <w:b/>
                 <w:sz w:val="19"/>
               </w:rPr>
-              <w:t>4,400</w:t>
             </w:r>
           </w:p>
         </w:tc>
         <w:tc>
           <w:tcPr>
-            <w:tcW w:type="dxa" w:w="2381"/>
-            <w:vAlign w:val="center"/>
+            <w:tcW w:type="dxa" w:w="1361"/>
+            <w:vAlign w:val="top"/>
             <w:shd w:val="clear" w:color="auto" w:fill="ebf8ff"/>
           </w:tcPr>
           <w:p>
@@ -1314,17 +1301,33 @@
             </w:r>
           </w:p>
         </w:tc>
+        <w:tc>
+          <w:tcPr>
+            <w:tcW w:type="dxa" w:w="1474"/>
+            <w:vAlign w:val="top"/>
+            <w:shd w:val="clear" w:color="auto" w:fill="ebf8ff"/>
+          </w:tcPr>
+          <w:p>
+            <w:r>
+              <w:rPr>
+                <w:b/>
+                <w:sz w:val="19"/>
+              </w:rPr>
+              <w:t>3,600（永久储备）</w:t>
+            </w:r>
+          </w:p>
+        </w:tc>
       </w:tr>
     </w:tbl>
     <w:p>
       <w:pPr>
-        <w:spacing w:before="280" w:after="80"/>
+        <w:spacing w:before="240" w:after="80"/>
       </w:pPr>
       <w:r>
         <w:rPr>
           <w:b/>
           <w:color w:val="1A365D"/>
-          <w:sz w:val="22"/>
+          <w:sz w:val="24"/>
         </w:rPr>
         <w:t>逢跌加速投入规则</w:t>
       </w:r>
@@ -1361,7 +1364,7 @@
         <w:rPr>
           <w:sz w:val="20"/>
         </w:rPr>
-        <w:t>单次最多提前部署两批次（RM 8,800），不得一次性动用全部余额。</w:t>
+        <w:t>单次最多提前部署两批次（RM 9,160），不得一次性动用全部余额。</w:t>
       </w:r>
     </w:p>
     <w:p>
@@ -1385,7 +1388,7 @@
         <w:rPr>
           <w:sz w:val="20"/>
         </w:rPr>
-        <w:t>RM 3,600 的 PeCDF-A 战术储备永远不动用于此规则——仅用于计划外的大幅回撤机会。</w:t>
+        <w:t>RM 3,600 的 PeCDF-A 战术储备永远不动用于此规则。</w:t>
       </w:r>
     </w:p>
     <w:p>

</xml_diff>